<commit_message>
Fix remaining bugs, clean project, update all docs to v1.5
- Fix French text remnants: "Tout" → "All", "Inspect un record" → "Inspect a record"
- Clean up header comment (remove outdated v1→v2 changelog)
- Add files/ to .gitignore, remove empty dirs
- Update metrics across all docs (README, 5 docx, 1 pptx): lines 3,758, app.jsx 2,823, content.js 576, bridge 286, 20 API actions
- Fix license inconsistency in STORE_LISTING.md (removed false MIT claim)
- Fix GitHub URL in PPTX slide 10 (colvio-d365 → colvio)
- Add utility scripts: generate-icons.js, pack.js

Co-Authored-By: Claude Opus 4.6 (1M context) <noreply@anthropic.com>
</commit_message>
<xml_diff>
--- a/docs/Colvio_Spec_Technique.docx
+++ b/docs/Colvio_Spec_Technique.docx
@@ -235,7 +235,7 @@
                 <w:sz w:val="22"/>
                 <w:szCs w:val="22"/>
               </w:rPr>
-              <w:t xml:space="preserve">3,741</w:t>
+              <w:t xml:space="preserve">3,758</w:t>
             </w:r>
           </w:p>
         </w:tc>
@@ -664,7 +664,7 @@
                 <w:sz w:val="22"/>
                 <w:szCs w:val="22"/>
               </w:rPr>
-              <w:t xml:space="preserve">2 958</w:t>
+              <w:t xml:space="preserve">3,758</w:t>
             </w:r>
           </w:p>
         </w:tc>
@@ -1149,7 +1149,7 @@
                 <w:sz w:val="22"/>
                 <w:szCs w:val="22"/>
               </w:rPr>
-              <w:t xml:space="preserve">539</w:t>
+              <w:t xml:space="preserve">576</w:t>
             </w:r>
           </w:p>
         </w:tc>
@@ -1377,7 +1377,7 @@
                 <w:sz w:val="22"/>
                 <w:szCs w:val="22"/>
               </w:rPr>
-              <w:t xml:space="preserve">2 255</w:t>
+              <w:t xml:space="preserve">2,823</w:t>
             </w:r>
           </w:p>
         </w:tc>
@@ -1491,7 +1491,7 @@
                 <w:sz w:val="22"/>
                 <w:szCs w:val="22"/>
               </w:rPr>
-              <w:t xml:space="preserve">268</w:t>
+              <w:t xml:space="preserve">286</w:t>
             </w:r>
           </w:p>
         </w:tc>

</xml_diff>